<commit_message>
Complete ISURO practice 3 cost accounting report
</commit_message>
<xml_diff>
--- a/4/ИСУРО/ИСУРО_3_АлбахтинИВ.docx
+++ b/4/ИСУРО/ИСУРО_3_АлбахтинИВ.docx
@@ -2718,7 +2718,7 @@
         <w:pStyle w:val="Основнойтекстотчёта"/>
       </w:pPr>
       <w:r>
-        <w:t>В регламентированном учёте отражены выручка Дт 62.01 Кт 91.01 на 6 000 руб. и НДС Дт 91.02 Кт 68.02 на 1 000 руб. Строка списания 50 шт. содержит количество, но денежная оценка себестоимости пока не рассчитана системой.</w:t>
+        <w:t>В регламентированном учёте отражены выручка Дт 62.01 Кт 91.01 на 6 000 руб. и НДС Дт 91.02 Кт 68.02 на 1 000 руб. При первичной проверке строка списания 50 шт. содержала только количество: денежная оценка появилась после расчёта себестоимости за январь.</w:t>
       </w:r>
     </w:p>
     <w:p>
@@ -2766,7 +2766,7 @@
         <w:pStyle w:val="Подписьрисунка"/>
       </w:pPr>
       <w:r>
-        <w:t>Рисунок 14 – Проводки реализации шурупов</w:t>
+        <w:t>Рисунок 14 – Проводки реализации до расчёта себестоимости</w:t>
       </w:r>
     </w:p>
     <w:p>
@@ -2830,7 +2830,7 @@
         <w:pStyle w:val="Основнойтекстотчёта"/>
       </w:pPr>
       <w:r>
-        <w:t>Возврат отражён в регламентированном учёте: сторнирована выручка по счетам 62.01 и 91.01, выполнен перенос НДС на 1 000 руб. Себестоимость возвращённых товаров будет уточнена после расчёта себестоимости.</w:t>
+        <w:t>Возврат отражён в регламентированном учёте: сторнирована выручка по счетам 62.01 и 91.01, выполнен перенос НДС на 1 000 руб. На первоначальном снимке себестоимость ещё не была рассчитана; окончательная сторнирующая сумма показана далее.</w:t>
       </w:r>
     </w:p>
     <w:p>
@@ -2878,7 +2878,7 @@
         <w:pStyle w:val="Подписьрисунка"/>
       </w:pPr>
       <w:r>
-        <w:t>Рисунок 16 – Проводки возврата от клиента</w:t>
+        <w:t>Рисунок 16 – Проводки возврата до расчёта себестоимости</w:t>
       </w:r>
     </w:p>
     <w:p>
@@ -3438,7 +3438,7 @@
         <w:pStyle w:val="Основнойтекстотчёта"/>
       </w:pPr>
       <w:r>
-        <w:t>Документ отражён в регламентированном учёте. Система сформировала Дт 50.02 Кт 91.01 на 2 700 руб., Дт 91.02 Кт 68.02 на 450 руб. и количественное списание одного стола Дт 91.02 Кт 43. Денежная оценка списания на момент проверки не заполнена: расчёт себестоимости ещё не выполнен.</w:t>
+        <w:t>Документ отражён в регламентированном учёте. Система сформировала Дт 50.02 Кт 91.01 на 2 700 руб., Дт 91.02 Кт 68.02 на 450 руб. и количественное списание одного стола Дт 91.02 Кт 43. На рисунке 27 зафиксировано состояние до расчёта: денежная оценка списания ещё не заполнена. Итоговая проводка со стоимостью приведена далее.</w:t>
       </w:r>
     </w:p>
     <w:p>
@@ -3486,7 +3486,7 @@
         <w:pStyle w:val="Подписьрисунка"/>
       </w:pPr>
       <w:r>
-        <w:t>Рисунок 27 – Проводки розничной реализации и предупреждение о себестоимости</w:t>
+        <w:t>Рисунок 27 – Проводки розничной реализации до расчёта себестоимости</w:t>
       </w:r>
     </w:p>
     <w:p>
@@ -3558,7 +3558,7 @@
         <w:pStyle w:val="Основнойтекстотчёта"/>
       </w:pPr>
       <w:r>
-        <w:t>Для транспортно-заготовительных расходов 5 600 руб. проведён документ распределения № 00000000001 от 31.01.2026. Аналитика указывает на приобретение сосновой доски № 0000-000002 от 22.01.2026, показатель распределения — количество товаров, отбор — «Доска сосновая». После проведения в списке статья получила состояние «Готово к распределению» в управленческом, бухгалтерском и налоговом учёте. Окончательное увеличение стоимости партии и суммы списания в продажах требуют расчёта себестоимости.</w:t>
+        <w:t>Для транспортно-заготовительных расходов 5 600 руб. проведён документ распределения № 00000000001 от 31.01.2026. Аналитика указывает на приобретение сосновой доски № 0000-000002 от 22.01.2026, показатель распределения — количество товаров, отбор — «Доска сосновая». После проведения статья была готова к распределению; окончательный результат проверен после расчёта себестоимости.</w:t>
       </w:r>
     </w:p>
     <w:p>
@@ -3662,7 +3662,7 @@
         <w:pStyle w:val="Основнойтекстотчёта"/>
       </w:pPr>
       <w:r>
-        <w:t>Для проверки денежной оценки запасов запущено предварительное закрытие января 2026 года. Расчёт себестоимости не выполнен: 1С показывает состояние «Расчёт невозможен» и пояснение «Не настроены все разделы учётной политики». На рисунке 31 приведено сообщение программы.</w:t>
+        <w:t>Первая попытка закрытия января была заблокирована: в организации отсутствовали разделы учётной политики (рисунки 31–32). Для учебной базы с января 2026 года заданы общий режим налогообложения, настройки НДС, бухгалтерская и финансовая учётная политика. В НСИ и администрировании для учёта себестоимости товаров указан месяц начала — январь 2026 года.</w:t>
       </w:r>
     </w:p>
     <w:p>
@@ -3710,16 +3710,7 @@
         <w:pStyle w:val="Подписьрисунка"/>
       </w:pPr>
       <w:r>
-        <w:t>Рисунок 31 – Сообщение 1С о невозможности расчёта за январь 2026 года</w:t>
-      </w:r>
-    </w:p>
-    <w:p>
-      <w:pPr>
-        <w:pStyle w:val="Основнойтекстотчёта"/>
-        <w:keepNext/>
-      </w:pPr>
-      <w:r>
-        <w:t>В карточке организации не заданы параметры налогообложения, финансового и бухгалтерского учёта (рисунок 32). Их значения не указаны в задании. После уточнения у преподавателя нужно заполнить учётную политику, повторить закрытие января и проверить себестоимость и стоимость остатков.</w:t>
+        <w:t>Рисунок 31 – Первоначальное сообщение о невозможности расчёта</w:t>
       </w:r>
     </w:p>
     <w:p>
@@ -3767,7 +3758,281 @@
         <w:pStyle w:val="Подписьрисунка"/>
       </w:pPr>
       <w:r>
-        <w:t>Рисунок 32 – Незаполненные параметры учётной политики учебной организации</w:t>
+        <w:t>Рисунок 32 – Первоначально незаполненные параметры учётной политики</w:t>
+      </w:r>
+    </w:p>
+    <w:p>
+      <w:pPr>
+        <w:pStyle w:val="Основнойтекстотчёта"/>
+      </w:pPr>
+      <w:r>
+        <w:t>После настройки выполнены операции закрытия января: расчёт сумм документов, курсовых разниц, распределение затрат и расчёт себестоимости. Программа перешла к последующим этапам; на рисунке 33 показано состояние рабочего места после выполнения расчёта. Статус транспортно-заготовительных расходов изменился на «Распределено» в управленческом, бухгалтерском и налоговом учёте (рисунок 34).</w:t>
+      </w:r>
+    </w:p>
+    <w:p>
+      <w:pPr>
+        <w:pStyle w:val="Иллюстрация"/>
+        <w:keepNext/>
+      </w:pPr>
+      <w:r>
+        <w:drawing>
+          <wp:inline xmlns:a="http://schemas.openxmlformats.org/drawingml/2006/main" xmlns:pic="http://schemas.openxmlformats.org/drawingml/2006/picture">
+            <wp:extent cx="5850000" cy="2719737"/>
+            <wp:docPr id="298370884" name="Picture 298370884"/>
+            <wp:cNvGraphicFramePr>
+              <a:graphicFrameLocks noChangeAspect="1"/>
+            </wp:cNvGraphicFramePr>
+            <a:graphic>
+              <a:graphicData uri="http://schemas.openxmlformats.org/drawingml/2006/picture">
+                <pic:pic>
+                  <pic:nvPicPr>
+                    <pic:cNvPr id="0" name="image.jpg"/>
+                    <pic:cNvPicPr/>
+                  </pic:nvPicPr>
+                  <pic:blipFill>
+                    <a:blip r:embed="rId49"/>
+                    <a:stretch>
+                      <a:fillRect/>
+                    </a:stretch>
+                  </pic:blipFill>
+                  <pic:spPr>
+                    <a:xfrm>
+                      <a:off x="0" y="0"/>
+                      <a:ext cx="5850000" cy="2719737"/>
+                    </a:xfrm>
+                    <a:prstGeom prst="rect"/>
+                  </pic:spPr>
+                </pic:pic>
+              </a:graphicData>
+            </a:graphic>
+          </wp:inline>
+        </w:drawing>
+      </w:r>
+    </w:p>
+    <w:p>
+      <w:pPr>
+        <w:pStyle w:val="Подписьрисунка"/>
+      </w:pPr>
+      <w:r>
+        <w:t>Рисунок 33 – Рабочее место закрытия месяца после расчёта себестоимости</w:t>
+      </w:r>
+    </w:p>
+    <w:p>
+      <w:pPr>
+        <w:pStyle w:val="Иллюстрация"/>
+        <w:keepNext/>
+      </w:pPr>
+      <w:r>
+        <w:drawing>
+          <wp:inline xmlns:a="http://schemas.openxmlformats.org/drawingml/2006/main" xmlns:pic="http://schemas.openxmlformats.org/drawingml/2006/picture">
+            <wp:extent cx="5850000" cy="1337143"/>
+            <wp:docPr id="298370885" name="Picture 298370885"/>
+            <wp:cNvGraphicFramePr>
+              <a:graphicFrameLocks noChangeAspect="1"/>
+            </wp:cNvGraphicFramePr>
+            <a:graphic>
+              <a:graphicData uri="http://schemas.openxmlformats.org/drawingml/2006/picture">
+                <pic:pic>
+                  <pic:nvPicPr>
+                    <pic:cNvPr id="0" name="image.jpg"/>
+                    <pic:cNvPicPr/>
+                  </pic:nvPicPr>
+                  <pic:blipFill>
+                    <a:blip r:embed="rId54"/>
+                    <a:stretch>
+                      <a:fillRect/>
+                    </a:stretch>
+                  </pic:blipFill>
+                  <pic:spPr>
+                    <a:xfrm>
+                      <a:off x="0" y="0"/>
+                      <a:ext cx="5850000" cy="1337143"/>
+                    </a:xfrm>
+                    <a:prstGeom prst="rect"/>
+                  </pic:spPr>
+                </pic:pic>
+              </a:graphicData>
+            </a:graphic>
+          </wp:inline>
+        </w:drawing>
+      </w:r>
+    </w:p>
+    <w:p>
+      <w:pPr>
+        <w:pStyle w:val="Подписьрисунка"/>
+      </w:pPr>
+      <w:r>
+        <w:t>Рисунок 34 – Распределение транспортно-заготовительных расходов в трёх видах учёта</w:t>
+      </w:r>
+    </w:p>
+    <w:p>
+      <w:pPr>
+        <w:pStyle w:val="Основнойтекстотчёта"/>
+      </w:pPr>
+      <w:r>
+        <w:t>После расчёта в реализации 50 шурупов сформирована проводка Дт 91.02 Кт 10.01 на 30 руб.; возврат сторнирует эту сумму на 30 руб. со знаком минус (рисунки 35–36). Таким образом, возврат восстановил количественный и стоимостный остаток шурупов.</w:t>
+      </w:r>
+    </w:p>
+    <w:p>
+      <w:pPr>
+        <w:pStyle w:val="Иллюстрация"/>
+        <w:keepNext/>
+      </w:pPr>
+      <w:r>
+        <w:drawing>
+          <wp:inline xmlns:a="http://schemas.openxmlformats.org/drawingml/2006/main" xmlns:pic="http://schemas.openxmlformats.org/drawingml/2006/picture">
+            <wp:extent cx="5850000" cy="2256429"/>
+            <wp:docPr id="298370886" name="Picture 298370886"/>
+            <wp:cNvGraphicFramePr>
+              <a:graphicFrameLocks noChangeAspect="1"/>
+            </wp:cNvGraphicFramePr>
+            <a:graphic>
+              <a:graphicData uri="http://schemas.openxmlformats.org/drawingml/2006/picture">
+                <pic:pic>
+                  <pic:nvPicPr>
+                    <pic:cNvPr id="0" name="image.jpg"/>
+                    <pic:cNvPicPr/>
+                  </pic:nvPicPr>
+                  <pic:blipFill>
+                    <a:blip r:embed="rId55"/>
+                    <a:stretch>
+                      <a:fillRect/>
+                    </a:stretch>
+                  </pic:blipFill>
+                  <pic:spPr>
+                    <a:xfrm>
+                      <a:off x="0" y="0"/>
+                      <a:ext cx="5850000" cy="2256429"/>
+                    </a:xfrm>
+                    <a:prstGeom prst="rect"/>
+                  </pic:spPr>
+                </pic:pic>
+              </a:graphicData>
+            </a:graphic>
+          </wp:inline>
+        </w:drawing>
+      </w:r>
+    </w:p>
+    <w:p>
+      <w:pPr>
+        <w:pStyle w:val="Подписьрисунка"/>
+      </w:pPr>
+      <w:r>
+        <w:t>Рисунок 35 – Себестоимость 50 проданных шурупов — 30 рублей</w:t>
+      </w:r>
+    </w:p>
+    <w:p>
+      <w:pPr>
+        <w:pStyle w:val="Иллюстрация"/>
+        <w:keepNext/>
+      </w:pPr>
+      <w:r>
+        <w:drawing>
+          <wp:inline xmlns:a="http://schemas.openxmlformats.org/drawingml/2006/main" xmlns:pic="http://schemas.openxmlformats.org/drawingml/2006/picture">
+            <wp:extent cx="5850000" cy="2548928"/>
+            <wp:docPr id="298370887" name="Picture 298370887"/>
+            <wp:cNvGraphicFramePr>
+              <a:graphicFrameLocks noChangeAspect="1"/>
+            </wp:cNvGraphicFramePr>
+            <a:graphic>
+              <a:graphicData uri="http://schemas.openxmlformats.org/drawingml/2006/picture">
+                <pic:pic>
+                  <pic:nvPicPr>
+                    <pic:cNvPr id="0" name="image.jpg"/>
+                    <pic:cNvPicPr/>
+                  </pic:nvPicPr>
+                  <pic:blipFill>
+                    <a:blip r:embed="rId56"/>
+                    <a:stretch>
+                      <a:fillRect/>
+                    </a:stretch>
+                  </pic:blipFill>
+                  <pic:spPr>
+                    <a:xfrm>
+                      <a:off x="0" y="0"/>
+                      <a:ext cx="5850000" cy="2548928"/>
+                    </a:xfrm>
+                    <a:prstGeom prst="rect"/>
+                  </pic:spPr>
+                </pic:pic>
+              </a:graphicData>
+            </a:graphic>
+          </wp:inline>
+        </w:drawing>
+      </w:r>
+    </w:p>
+    <w:p>
+      <w:pPr>
+        <w:pStyle w:val="Подписьрисунка"/>
+      </w:pPr>
+      <w:r>
+        <w:t>Рисунок 36 – Сторнирование себестоимости 50 возвращённых шурупов</w:t>
+      </w:r>
+    </w:p>
+    <w:p>
+      <w:pPr>
+        <w:pStyle w:val="Основнойтекстотчёта"/>
+        <w:keepLines/>
+      </w:pPr>
+      <w:r>
+        <w:t>В розничной продаже одного стола сформирована проводка Дт 91.02 Кт 43 на 6 300 руб. (рисунок 37). Выручка составляет 2 700 руб., в том числе НДС 450 руб.; выручка без НДС — 2 250 руб. По выбранным для учебного примера ценам продажа убыточна на 4 050 руб. до учёта прочих расходов.</w:t>
+      </w:r>
+    </w:p>
+    <w:p>
+      <w:pPr>
+        <w:pStyle w:val="Иллюстрация"/>
+        <w:keepNext/>
+      </w:pPr>
+      <w:r>
+        <w:drawing>
+          <wp:inline xmlns:a="http://schemas.openxmlformats.org/drawingml/2006/main" xmlns:pic="http://schemas.openxmlformats.org/drawingml/2006/picture">
+            <wp:extent cx="5850000" cy="2256429"/>
+            <wp:docPr id="298370888" name="Picture 298370888"/>
+            <wp:cNvGraphicFramePr>
+              <a:graphicFrameLocks noChangeAspect="1"/>
+            </wp:cNvGraphicFramePr>
+            <a:graphic>
+              <a:graphicData uri="http://schemas.openxmlformats.org/drawingml/2006/picture">
+                <pic:pic>
+                  <pic:nvPicPr>
+                    <pic:cNvPr id="0" name="image.jpg"/>
+                    <pic:cNvPicPr/>
+                  </pic:nvPicPr>
+                  <pic:blipFill>
+                    <a:blip r:embed="rId57"/>
+                    <a:stretch>
+                      <a:fillRect/>
+                    </a:stretch>
+                  </pic:blipFill>
+                  <pic:spPr>
+                    <a:xfrm>
+                      <a:off x="0" y="0"/>
+                      <a:ext cx="5850000" cy="2256429"/>
+                    </a:xfrm>
+                    <a:prstGeom prst="rect"/>
+                  </pic:spPr>
+                </pic:pic>
+              </a:graphicData>
+            </a:graphic>
+          </wp:inline>
+        </w:drawing>
+      </w:r>
+    </w:p>
+    <w:p>
+      <w:pPr>
+        <w:pStyle w:val="Подписьрисунка"/>
+      </w:pPr>
+      <w:r>
+        <w:t>Рисунок 37 – Рассчитанная себестоимость проданного стола — 6 300 рублей</w:t>
+      </w:r>
+    </w:p>
+    <w:p>
+      <w:pPr>
+        <w:pStyle w:val="Основнойтекстотчёта"/>
+        <w:keepLines/>
+      </w:pPr>
+      <w:r>
+        <w:t>Полное закрытие месяца остаётся с невыполненными операциями по статье «Услуги связи» подразделения «Отдел закупок»: 1С сообщает, что для неё не заполнена база распределения по партиям. Эта отдельная статья не относится к доставке и продаже товаров, рассмотренным в работе; её настройка требует уточнения основания расхода. Расчёт себестоимости товаров и распределение транспортно-заготовительных расходов уже выполнены.</w:t>
       </w:r>
     </w:p>
     <w:p>
@@ -3783,7 +4048,7 @@
         <w:pStyle w:val="Основнойтекстотчёта"/>
       </w:pPr>
       <w:r>
-        <w:t>В учебной базе оформлены поступления материалов и столов, доставка, возвраты поставщикам, оптовая реализация и возврат от клиента, отдельная партия для розницы, установка цены, межскладское перемещение, касса ККМ и розничная продажа. Документ распределения доставки проведён, количественные остатки подтверждены ведомостью. Расчёт себестоимости остановлен из-за отсутствующих параметров учётной политики организации. Поэтому денежные суммы списания товаров и итоговая оценка запасов пока не подтверждены.</w:t>
+        <w:t>В учебной базе оформлены поступления материалов и столов, доставка, возвраты поставщикам, оптовая реализация и возврат от клиента, отдельная партия для розницы, установка цены, межскладское перемещение, касса ККМ и розничная продажа. Количественные остатки подтверждены ведомостью. После настройки учётной политики за январь рассчитана себестоимость товаров: списание 50 шурупов составило 30 руб. и сторнировано возвратом, списание одного стола — 6 300 руб.; транспортно-заготовительные расходы 5 600 руб. распределены в трёх видах учёта. Полное закрытие месяца требует отдельно настроить базу распределения для статьи «Услуги связи».</w:t>
       </w:r>
     </w:p>
     <w:sectPr>

</xml_diff>